<commit_message>
Hotfix: Se incorporan placeholder para empresa y rut empresa en declaración jurada y poder simple
</commit_message>
<xml_diff>
--- a/frontend/public/Declaraciones Juradas Cramer Formato.docx
+++ b/frontend/public/Declaraciones Juradas Cramer Formato.docx
@@ -186,7 +186,7 @@
           <w:sz w:val="20"/>
           <w:szCs w:val="20"/>
         </w:rPr>
-        <w:t>Carlos Cramer Productos Aromáticos S.A.C.I.</w:t>
+        <w:t>{{empresa}}</w:t>
       </w:r>
       <w:r>
         <w:rPr>
@@ -203,61 +203,7 @@
           <w:sz w:val="20"/>
           <w:szCs w:val="20"/>
         </w:rPr>
-        <w:t>92</w:t>
-      </w:r>
-      <w:r>
-        <w:rPr>
-          <w:rFonts w:ascii="Arial" w:eastAsia="Arial" w:hAnsi="Arial" w:cs="Arial"/>
-          <w:b/>
-          <w:sz w:val="20"/>
-          <w:szCs w:val="20"/>
-        </w:rPr>
-        <w:t>.</w:t>
-      </w:r>
-      <w:r>
-        <w:rPr>
-          <w:rFonts w:ascii="Arial" w:eastAsia="Arial" w:hAnsi="Arial" w:cs="Arial"/>
-          <w:b/>
-          <w:sz w:val="20"/>
-          <w:szCs w:val="20"/>
-        </w:rPr>
-        <w:t>845</w:t>
-      </w:r>
-      <w:r>
-        <w:rPr>
-          <w:rFonts w:ascii="Arial" w:eastAsia="Arial" w:hAnsi="Arial" w:cs="Arial"/>
-          <w:b/>
-          <w:sz w:val="20"/>
-          <w:szCs w:val="20"/>
-        </w:rPr>
-        <w:t>.</w:t>
-      </w:r>
-      <w:r>
-        <w:rPr>
-          <w:rFonts w:ascii="Arial" w:eastAsia="Arial" w:hAnsi="Arial" w:cs="Arial"/>
-          <w:b/>
-          <w:sz w:val="20"/>
-          <w:szCs w:val="20"/>
-        </w:rPr>
-        <w:t>000</w:t>
-      </w:r>
-      <w:r>
-        <w:rPr>
-          <w:rFonts w:ascii="Arial" w:eastAsia="Arial" w:hAnsi="Arial" w:cs="Arial"/>
-          <w:b/>
-          <w:sz w:val="20"/>
-          <w:szCs w:val="20"/>
-        </w:rPr>
-        <w:t>-</w:t>
-      </w:r>
-      <w:r>
-        <w:rPr>
-          <w:rFonts w:ascii="Arial" w:eastAsia="Arial" w:hAnsi="Arial" w:cs="Arial"/>
-          <w:b/>
-          <w:sz w:val="20"/>
-          <w:szCs w:val="20"/>
-        </w:rPr>
-        <w:t>7</w:t>
+        <w:t>{{rut_empresa}}</w:t>
       </w:r>
       <w:r>
         <w:rPr>

</xml_diff>